<commit_message>
Name BAFH in the current role, and correct the frontend stack
The sole-engineer bullets described the work generically; the client-facing
one now leads with BAFH — the UK trade-federation membership platform — so
the scale of the domain is visible without a project section. Laravel pairs
with React, not Vue.js, on this engagement. Client-contact and deployment
bullets merged to keep the list at four.

Regenerated the PDF and DOCX to match.

Co-Authored-By: Claude Opus 5 (1M context) <noreply@anthropic.com>
</commit_message>
<xml_diff>
--- a/resume/Nahid_Hasan_CV.docx
+++ b/resume/Nahid_Hasan_CV.docx
@@ -195,7 +195,7 @@
                   <w:u w:val="single"/>
                   <w:rtl w:val="0"/>
                 </w:rPr>
-                <w:t xml:space="preserve">iamnahid.framer.website</w:t>
+                <w:t xml:space="preserve">nahidhasan.online</w:t>
               </w:r>
             </w:hyperlink>
             <w:r>
@@ -673,7 +673,7 @@
           <w:szCs w:val="19"/>
           <w:rtl w:val="0"/>
         </w:rPr>
-        <w:t xml:space="preserve">Develop scalable backend services and responsive frontends with Laravel and Vue.js, maintaining code quality standards without peer-review overhead.</w:t>
+        <w:t xml:space="preserve">Lead pre-development R&amp;D and architecture mapping for BAFH, a UK trade-federation membership platform connecting thousands of Asian restaurant and hospitality businesses with industry suppliers, monetized through sponsorship and a national awards event.</w:t>
       </w:r>
     </w:p>
     <w:p>
@@ -692,7 +692,7 @@
           <w:szCs w:val="19"/>
           <w:rtl w:val="0"/>
         </w:rPr>
-        <w:t xml:space="preserve">Manage deployment and infrastructure end to end — Nginx configuration, CI/CD automation, environment parity, and monitoring — for reliable releases.</w:t>
+        <w:t xml:space="preserve">Develop scalable backend services and responsive frontends with Laravel and React, maintaining code quality standards without peer-review overhead.</w:t>
       </w:r>
     </w:p>
     <w:p>
@@ -711,7 +711,7 @@
           <w:szCs w:val="19"/>
           <w:rtl w:val="0"/>
         </w:rPr>
-        <w:t xml:space="preserve">Act as the single technical point of contact for clients, translating feedback into scoped, shipped features.</w:t>
+        <w:t xml:space="preserve">Manage deployment and infrastructure end to end — Nginx configuration, CI/CD automation, environment parity, and monitoring — while serving as the single technical point of contact for clients, translating feedback into scoped, shipped releases.</w:t>
       </w:r>
     </w:p>
     <w:p>

</xml_diff>